<commit_message>
docs: update project plan, add architecture diagram, remove fill.md
</commit_message>
<xml_diff>
--- a/doc/2026 AI 大赛项目计划书.docx
+++ b/doc/2026 AI 大赛项目计划书.docx
@@ -394,11 +394,15 @@
     </w:p>
     <w:p>
       <w:r>
-        <w:rPr>
-          <w:i/>
-          <w:iCs/>
-        </w:rPr>
-        <w:t>(请描述当前业务或技术的痛点，以及本项目希望解决的核心问题，建议100–200字。)</w:t>
+        <w:t>当前AIGC工具（如豆包）已能快速生成儿童涂色页、换装等创意图片，但生成即止步于屏幕——孩子只能看、不能玩。要将图片变为可涂色的实物，家长需在AI应用、电脑、打印机之间反复操作，流程繁琐。线下</w:t>
+      </w:r>
+      <w:proofErr w:type="gramStart"/>
+      <w:r>
+        <w:t>安静书</w:t>
+      </w:r>
+      <w:proofErr w:type="gramEnd"/>
+      <w:r>
+        <w:t>模板固定，无法满足孩子的个性化需求。核心矛盾在于：孩子需要能拿在手里的定制化实物，而现有方案要么无法定制、要么操作门槛高，导致孩子只能被动盯着屏幕，错失触觉创作和动手涂色的乐趣。本项目打造一款让孩子独立操作的AI智能对话打印机，通过语音指令直接完成从"想法"到"打印出纸"的完整闭环。</w:t>
       </w:r>
     </w:p>
     <w:p>
@@ -424,7 +428,10 @@
         </w:numPr>
       </w:pPr>
       <w:r>
-        <w:t>目标 1：[例如：实现3分钟内自动生成高质量短视频]</w:t>
+        <w:rPr>
+          <w:rFonts w:hint="eastAsia"/>
+        </w:rPr>
+        <w:t>目标 1：打造一款5-12岁儿童可独立操作的AI智能对话打印机，实现“语音指令→AI生成→热敏打印”完整闭环，支持涂色页、剪纸、换装三种内容模式。</w:t>
       </w:r>
     </w:p>
     <w:p>
@@ -435,7 +442,94 @@
         </w:numPr>
       </w:pPr>
       <w:r>
-        <w:t>目标 2：[例如：本地模型库推理速度提升30%]</w:t>
+        <w:rPr>
+          <w:rFonts w:hint="eastAsia"/>
+        </w:rPr>
+        <w:t>目标 2：6个月内完成100台MVP原型生产与种子用户测试；12个月内实现月销1,000台、NPS≥60、</w:t>
+      </w:r>
+      <w:proofErr w:type="gramStart"/>
+      <w:r>
+        <w:rPr>
+          <w:rFonts w:hint="eastAsia"/>
+        </w:rPr>
+        <w:t>用户月活跃</w:t>
+      </w:r>
+      <w:proofErr w:type="gramEnd"/>
+      <w:r>
+        <w:rPr>
+          <w:rFonts w:hint="eastAsia"/>
+        </w:rPr>
+        <w:t>度≥70%。</w:t>
+      </w:r>
+    </w:p>
+    <w:p>
+      <w:pPr>
+        <w:numPr>
+          <w:ilvl w:val="0"/>
+          <w:numId w:val="4"/>
+        </w:numPr>
+      </w:pPr>
+      <w:r>
+        <w:rPr>
+          <w:rFonts w:hint="eastAsia"/>
+        </w:rPr>
+        <w:t>目标 3：基于成熟热敏打印供应链（成本¥268/台）和</w:t>
+      </w:r>
+      <w:proofErr w:type="gramStart"/>
+      <w:r>
+        <w:rPr>
+          <w:rFonts w:hint="eastAsia"/>
+        </w:rPr>
+        <w:t>通义万相</w:t>
+      </w:r>
+      <w:proofErr w:type="gramEnd"/>
+      <w:r>
+        <w:rPr>
+          <w:rFonts w:hint="eastAsia"/>
+        </w:rPr>
+        <w:t>API，整合团队硬件+AI集成技术能力，将首年资金需求控制在约¥110万。</w:t>
+      </w:r>
+    </w:p>
+    <w:p>
+      <w:pPr>
+        <w:numPr>
+          <w:ilvl w:val="0"/>
+          <w:numId w:val="4"/>
+        </w:numPr>
+      </w:pPr>
+      <w:r>
+        <w:rPr>
+          <w:rFonts w:hint="eastAsia"/>
+        </w:rPr>
+        <w:t>目标 4：精准解决AIGC内容无法实物化、孩子无法独立操作</w:t>
+      </w:r>
+      <w:proofErr w:type="gramStart"/>
+      <w:r>
+        <w:rPr>
+          <w:rFonts w:hint="eastAsia"/>
+        </w:rPr>
+        <w:t>的刚需痛点</w:t>
+      </w:r>
+      <w:proofErr w:type="gramEnd"/>
+      <w:r>
+        <w:rPr>
+          <w:rFonts w:hint="eastAsia"/>
+        </w:rPr>
+        <w:t>，成功切入并契合教育智能硬件739亿市场的增长趋势。</w:t>
+      </w:r>
+    </w:p>
+    <w:p>
+      <w:pPr>
+        <w:numPr>
+          <w:ilvl w:val="0"/>
+          <w:numId w:val="4"/>
+        </w:numPr>
+      </w:pPr>
+      <w:r>
+        <w:rPr>
+          <w:rFonts w:hint="eastAsia"/>
+        </w:rPr>
+        <w:t>目标 5：严格把控项目节奏，0-6个月完成原型开发与验证，6-12个月实现量产上市，并在24个月内达成盈亏平衡。</w:t>
       </w:r>
     </w:p>
     <w:p>
@@ -467,12 +561,107 @@
     <w:p>
       <w:pPr>
         <w:numPr>
+          <w:ilvl w:val="1"/>
+          <w:numId w:val="5"/>
+        </w:numPr>
+      </w:pPr>
+      <w:r>
+        <w:t>AI语音对话生成：孩子直接对设备说出想法（如"我要一只穿宇航服的兔子"），设备通过语音识别+大模型文生图，实时生成定制内容，无需家长介入。</w:t>
+      </w:r>
+    </w:p>
+    <w:p>
+      <w:pPr>
+        <w:numPr>
+          <w:ilvl w:val="1"/>
+          <w:numId w:val="5"/>
+        </w:numPr>
+      </w:pPr>
+      <w:r>
+        <w:t>2. 一键热敏打印：生成即打印，A5大幅面出纸，孩子拿到即可涂色、剪贴。支持涂色页、换装、剪纸三种模式。</w:t>
+      </w:r>
+    </w:p>
+    <w:p>
+      <w:pPr>
+        <w:numPr>
+          <w:ilvl w:val="1"/>
+          <w:numId w:val="5"/>
+        </w:numPr>
+      </w:pPr>
+      <w:r>
+        <w:t>3. 交互屏+离线唤醒：2寸TFT屏辅助操作引导，</w:t>
+      </w:r>
+      <w:proofErr w:type="gramStart"/>
+      <w:r>
+        <w:t>启英泰</w:t>
+      </w:r>
+      <w:proofErr w:type="gramEnd"/>
+      <w:r>
+        <w:t>伦离线芯片支持语音唤醒，在线/离线双模运行。</w:t>
+      </w:r>
+    </w:p>
+    <w:p>
+      <w:pPr>
+        <w:numPr>
+          <w:ilvl w:val="2"/>
+          <w:numId w:val="5"/>
+        </w:numPr>
+      </w:pPr>
+      <w:r>
+        <w:t>4. 家长授权管控：家长APP可设置内容类型、使用时长、查看打印历史，确保内容安全。</w:t>
+      </w:r>
+    </w:p>
+    <w:p>
+      <w:pPr>
+        <w:numPr>
           <w:ilvl w:val="0"/>
           <w:numId w:val="5"/>
         </w:numPr>
       </w:pPr>
       <w:r>
+        <w:lastRenderedPageBreak/>
         <w:t>[差异化竞争优势]</w:t>
+      </w:r>
+    </w:p>
+    <w:p>
+      <w:pPr>
+        <w:pStyle w:val="ListParagraph"/>
+        <w:numPr>
+          <w:ilvl w:val="1"/>
+          <w:numId w:val="5"/>
+        </w:numPr>
+      </w:pPr>
+      <w:r>
+        <w:rPr>
+          <w:rFonts w:hint="eastAsia"/>
+        </w:rPr>
+        <w:t>与传统</w:t>
+      </w:r>
+      <w:r>
+        <w:t>AI App、安静书、</w:t>
+      </w:r>
+      <w:proofErr w:type="gramStart"/>
+      <w:r>
+        <w:t>喵喵</w:t>
+      </w:r>
+      <w:proofErr w:type="gramEnd"/>
+      <w:r>
+        <w:t>机等方案相比，本项目的核心差异在于：孩子独立完成从"想法"到"拿到实物"的完整闭环，无需家长操作电脑或手机。对比</w:t>
+      </w:r>
+      <w:proofErr w:type="spellStart"/>
+      <w:r>
+        <w:t>Stickerbox</w:t>
+      </w:r>
+      <w:proofErr w:type="spellEnd"/>
+      <w:r>
+        <w:t>（美国$99.99热敏贴纸打印机），本项目聚焦A5大幅面涂色页（非贴纸）、¥329价位更适合中国市场、增加屏幕</w:t>
+      </w:r>
+      <w:proofErr w:type="gramStart"/>
+      <w:r>
+        <w:t>交互和</w:t>
+      </w:r>
+      <w:proofErr w:type="gramEnd"/>
+      <w:r>
+        <w:t>家长管控模块。在AIGC"屏幕过剩"的时代，让孩子重新拿到可以涂色的纸。</w:t>
       </w:r>
     </w:p>
     <w:p>
@@ -514,7 +703,43 @@
         <w:t>模型类别：</w:t>
       </w:r>
       <w:r>
-        <w:t xml:space="preserve"> [ ] LLM    [ ] VLM    [ ] Image/</w:t>
+        <w:t xml:space="preserve"> [ ] LLM    [ </w:t>
+      </w:r>
+      <w:r>
+        <w:rPr>
+          <w:rFonts w:eastAsiaTheme="minorHAnsi"/>
+        </w:rPr>
+        <w:t>*</w:t>
+      </w:r>
+      <w:r>
+        <w:rPr>
+          <w:rFonts w:eastAsiaTheme="minorHAnsi" w:hint="eastAsia"/>
+        </w:rPr>
+        <w:t xml:space="preserve"> </w:t>
+      </w:r>
+      <w:r>
+        <w:t>] VLM    [</w:t>
+      </w:r>
+      <w:r>
+        <w:rPr>
+          <w:rFonts w:hint="eastAsia"/>
+        </w:rPr>
+        <w:t xml:space="preserve"> </w:t>
+      </w:r>
+      <w:r>
+        <w:rPr>
+          <w:rFonts w:eastAsiaTheme="minorHAnsi"/>
+        </w:rPr>
+        <w:t>*</w:t>
+      </w:r>
+      <w:r>
+        <w:rPr>
+          <w:rFonts w:eastAsiaTheme="minorHAnsi" w:hint="eastAsia"/>
+        </w:rPr>
+        <w:t xml:space="preserve"> </w:t>
+      </w:r>
+      <w:r>
+        <w:t>] Image/</w:t>
       </w:r>
       <w:proofErr w:type="spellStart"/>
       <w:r>
@@ -554,7 +779,28 @@
         </w:numPr>
       </w:pPr>
       <w:r>
-        <w:t>[ ] 纯 API 调用 (Zero-shot / Few-shot)</w:t>
+        <w:t>[</w:t>
+      </w:r>
+      <w:r>
+        <w:rPr>
+          <w:rFonts w:hint="eastAsia"/>
+        </w:rPr>
+        <w:t xml:space="preserve"> </w:t>
+      </w:r>
+      <w:r>
+        <w:rPr>
+          <w:rFonts w:eastAsiaTheme="minorHAnsi"/>
+        </w:rPr>
+        <w:t>*</w:t>
+      </w:r>
+      <w:r>
+        <w:rPr>
+          <w:rFonts w:eastAsiaTheme="minorHAnsi" w:hint="eastAsia"/>
+        </w:rPr>
+        <w:t xml:space="preserve"> </w:t>
+      </w:r>
+      <w:r>
+        <w:t>] 纯 API 调用 (Zero-shot / Few-shot)</w:t>
       </w:r>
     </w:p>
     <w:p>
@@ -607,7 +853,51 @@
     </w:p>
     <w:p>
       <w:r>
-        <w:t>[ 请在此处插入系统整体逻辑架构图或UI原型图 ]</w:t>
+        <w:rPr>
+          <w:noProof/>
+        </w:rPr>
+        <w:lastRenderedPageBreak/>
+        <w:drawing>
+          <wp:inline distT="0" distB="0" distL="0" distR="0" wp14:anchorId="684A5AC6" wp14:editId="37E88B72">
+            <wp:extent cx="5274310" cy="6405245"/>
+            <wp:effectExtent l="0" t="0" r="2540" b="0"/>
+            <wp:docPr id="1053807340" name="Picture 2"/>
+            <wp:cNvGraphicFramePr>
+              <a:graphicFrameLocks xmlns:a="http://schemas.openxmlformats.org/drawingml/2006/main" noChangeAspect="1"/>
+            </wp:cNvGraphicFramePr>
+            <a:graphic xmlns:a="http://schemas.openxmlformats.org/drawingml/2006/main">
+              <a:graphicData uri="http://schemas.openxmlformats.org/drawingml/2006/picture">
+                <pic:pic xmlns:pic="http://schemas.openxmlformats.org/drawingml/2006/picture">
+                  <pic:nvPicPr>
+                    <pic:cNvPr id="1053807340" name="Picture 1053807340"/>
+                    <pic:cNvPicPr/>
+                  </pic:nvPicPr>
+                  <pic:blipFill>
+                    <a:blip r:embed="rId5" cstate="print">
+                      <a:extLst>
+                        <a:ext uri="{28A0092B-C50C-407E-A947-70E740481C1C}">
+                          <a14:useLocalDpi xmlns:a14="http://schemas.microsoft.com/office/drawing/2010/main" val="0"/>
+                        </a:ext>
+                      </a:extLst>
+                    </a:blip>
+                    <a:stretch>
+                      <a:fillRect/>
+                    </a:stretch>
+                  </pic:blipFill>
+                  <pic:spPr>
+                    <a:xfrm>
+                      <a:off x="0" y="0"/>
+                      <a:ext cx="5274310" cy="6405245"/>
+                    </a:xfrm>
+                    <a:prstGeom prst="rect">
+                      <a:avLst/>
+                    </a:prstGeom>
+                  </pic:spPr>
+                </pic:pic>
+              </a:graphicData>
+            </a:graphic>
+          </wp:inline>
+        </w:drawing>
       </w:r>
     </w:p>
     <w:p>
@@ -628,6 +918,7 @@
     <w:tbl>
       <w:tblPr>
         <w:tblW w:w="0" w:type="auto"/>
+        <w:shd w:val="clear" w:color="auto" w:fill="FFFFFF"/>
         <w:tblCellMar>
           <w:top w:w="15" w:type="dxa"/>
           <w:left w:w="15" w:type="dxa"/>
@@ -637,9 +928,9 @@
         <w:tblLook w:val="04A0" w:firstRow="1" w:lastRow="0" w:firstColumn="1" w:lastColumn="0" w:noHBand="0" w:noVBand="1"/>
       </w:tblPr>
       <w:tblGrid>
-        <w:gridCol w:w="1203"/>
-        <w:gridCol w:w="1203"/>
-        <w:gridCol w:w="1152"/>
+        <w:gridCol w:w="2929"/>
+        <w:gridCol w:w="4221"/>
+        <w:gridCol w:w="1140"/>
       </w:tblGrid>
       <w:tr>
         <w:trPr>
@@ -649,18 +940,20 @@
           <w:tcPr>
             <w:tcW w:w="0" w:type="auto"/>
             <w:tcBorders>
-              <w:top w:val="single" w:sz="6" w:space="0" w:color="000000"/>
-              <w:left w:val="single" w:sz="6" w:space="0" w:color="000000"/>
-              <w:bottom w:val="single" w:sz="6" w:space="0" w:color="000000"/>
-              <w:right w:val="single" w:sz="6" w:space="0" w:color="000000"/>
-            </w:tcBorders>
-            <w:shd w:val="clear" w:color="auto" w:fill="F2F2F2"/>
-            <w:tcMar>
-              <w:top w:w="120" w:type="dxa"/>
-              <w:left w:w="120" w:type="dxa"/>
-              <w:bottom w:w="120" w:type="dxa"/>
-              <w:right w:w="120" w:type="dxa"/>
-            </w:tcMar>
+              <w:top w:val="single" w:sz="6" w:space="0" w:color="auto"/>
+              <w:left w:val="single" w:sz="6" w:space="0" w:color="auto"/>
+              <w:bottom w:val="single" w:sz="6" w:space="0" w:color="auto"/>
+              <w:right w:val="single" w:sz="6" w:space="0" w:color="auto"/>
+            </w:tcBorders>
+            <w:shd w:val="clear" w:color="auto" w:fill="D9D9D9" w:themeFill="background1" w:themeFillShade="D9"/>
+            <w:noWrap/>
+            <w:tcMar>
+              <w:top w:w="150" w:type="dxa"/>
+              <w:left w:w="210" w:type="dxa"/>
+              <w:bottom w:w="150" w:type="dxa"/>
+              <w:right w:w="210" w:type="dxa"/>
+            </w:tcMar>
+            <w:vAlign w:val="center"/>
             <w:hideMark/>
           </w:tcPr>
           <w:p>
@@ -668,146 +961,1198 @@
               <w:rPr>
                 <w:b/>
                 <w:bCs/>
+                <w:sz w:val="18"/>
+                <w:szCs w:val="18"/>
               </w:rPr>
             </w:pPr>
             <w:r>
-              <w:t>技术难点</w:t>
-            </w:r>
-          </w:p>
-        </w:tc>
-        <w:tc>
-          <w:tcPr>
-            <w:tcW w:w="0" w:type="auto"/>
-            <w:tcBorders>
-              <w:top w:val="single" w:sz="6" w:space="0" w:color="000000"/>
-              <w:left w:val="single" w:sz="6" w:space="0" w:color="000000"/>
-              <w:bottom w:val="single" w:sz="6" w:space="0" w:color="000000"/>
-              <w:right w:val="single" w:sz="6" w:space="0" w:color="000000"/>
-            </w:tcBorders>
-            <w:shd w:val="clear" w:color="auto" w:fill="F2F2F2"/>
-            <w:tcMar>
-              <w:top w:w="120" w:type="dxa"/>
-              <w:left w:w="120" w:type="dxa"/>
-              <w:bottom w:w="120" w:type="dxa"/>
-              <w:right w:w="120" w:type="dxa"/>
-            </w:tcMar>
-            <w:hideMark/>
-          </w:tcPr>
-          <w:p>
-            <w:pPr>
-              <w:rPr>
+              <w:rPr>
+                <w:rFonts w:hint="eastAsia"/>
                 <w:b/>
                 <w:bCs/>
-              </w:rPr>
-            </w:pPr>
-            <w:r>
-              <w:t>解决方案</w:t>
-            </w:r>
-          </w:p>
-        </w:tc>
-        <w:tc>
-          <w:tcPr>
-            <w:tcW w:w="0" w:type="auto"/>
-            <w:tcBorders>
-              <w:top w:val="single" w:sz="6" w:space="0" w:color="000000"/>
-              <w:left w:val="single" w:sz="6" w:space="0" w:color="000000"/>
-              <w:bottom w:val="single" w:sz="6" w:space="0" w:color="000000"/>
-              <w:right w:val="single" w:sz="6" w:space="0" w:color="000000"/>
-            </w:tcBorders>
-            <w:shd w:val="clear" w:color="auto" w:fill="F2F2F2"/>
-            <w:tcMar>
-              <w:top w:w="120" w:type="dxa"/>
-              <w:left w:w="120" w:type="dxa"/>
-              <w:bottom w:w="120" w:type="dxa"/>
-              <w:right w:w="120" w:type="dxa"/>
-            </w:tcMar>
+                <w:sz w:val="18"/>
+                <w:szCs w:val="18"/>
+              </w:rPr>
+              <w:t>技术难点</w:t>
+            </w:r>
+          </w:p>
+        </w:tc>
+        <w:tc>
+          <w:tcPr>
+            <w:tcW w:w="0" w:type="auto"/>
+            <w:tcBorders>
+              <w:top w:val="single" w:sz="6" w:space="0" w:color="auto"/>
+              <w:left w:val="single" w:sz="6" w:space="0" w:color="auto"/>
+              <w:bottom w:val="single" w:sz="6" w:space="0" w:color="auto"/>
+              <w:right w:val="single" w:sz="6" w:space="0" w:color="auto"/>
+            </w:tcBorders>
+            <w:shd w:val="clear" w:color="auto" w:fill="D9D9D9" w:themeFill="background1" w:themeFillShade="D9"/>
+            <w:noWrap/>
+            <w:tcMar>
+              <w:top w:w="150" w:type="dxa"/>
+              <w:left w:w="210" w:type="dxa"/>
+              <w:bottom w:w="150" w:type="dxa"/>
+              <w:right w:w="210" w:type="dxa"/>
+            </w:tcMar>
+            <w:vAlign w:val="center"/>
             <w:hideMark/>
           </w:tcPr>
           <w:p>
             <w:pPr>
               <w:rPr>
+                <w:rFonts w:hint="eastAsia"/>
                 <w:b/>
                 <w:bCs/>
+                <w:sz w:val="18"/>
+                <w:szCs w:val="18"/>
               </w:rPr>
             </w:pPr>
             <w:r>
+              <w:rPr>
+                <w:rFonts w:hint="eastAsia"/>
+                <w:b/>
+                <w:bCs/>
+                <w:sz w:val="18"/>
+                <w:szCs w:val="18"/>
+              </w:rPr>
+              <w:t>解决方案</w:t>
+            </w:r>
+          </w:p>
+        </w:tc>
+        <w:tc>
+          <w:tcPr>
+            <w:tcW w:w="0" w:type="auto"/>
+            <w:tcBorders>
+              <w:top w:val="single" w:sz="6" w:space="0" w:color="auto"/>
+              <w:left w:val="single" w:sz="6" w:space="0" w:color="auto"/>
+              <w:bottom w:val="single" w:sz="6" w:space="0" w:color="auto"/>
+              <w:right w:val="single" w:sz="6" w:space="0" w:color="auto"/>
+            </w:tcBorders>
+            <w:shd w:val="clear" w:color="auto" w:fill="D9D9D9" w:themeFill="background1" w:themeFillShade="D9"/>
+            <w:noWrap/>
+            <w:tcMar>
+              <w:top w:w="150" w:type="dxa"/>
+              <w:left w:w="210" w:type="dxa"/>
+              <w:bottom w:w="150" w:type="dxa"/>
+              <w:right w:w="210" w:type="dxa"/>
+            </w:tcMar>
+            <w:vAlign w:val="center"/>
+            <w:hideMark/>
+          </w:tcPr>
+          <w:p>
+            <w:pPr>
+              <w:rPr>
+                <w:rFonts w:hint="eastAsia"/>
+                <w:b/>
+                <w:bCs/>
+                <w:sz w:val="18"/>
+                <w:szCs w:val="18"/>
+              </w:rPr>
+            </w:pPr>
+            <w:r>
+              <w:rPr>
+                <w:rFonts w:hint="eastAsia"/>
+                <w:b/>
+                <w:bCs/>
+                <w:sz w:val="18"/>
+                <w:szCs w:val="18"/>
+              </w:rPr>
               <w:t>风险评估</w:t>
             </w:r>
           </w:p>
         </w:tc>
       </w:tr>
       <w:tr>
-        <w:tc>
-          <w:tcPr>
-            <w:tcW w:w="0" w:type="auto"/>
-            <w:tcBorders>
-              <w:top w:val="single" w:sz="6" w:space="0" w:color="000000"/>
-              <w:left w:val="single" w:sz="6" w:space="0" w:color="000000"/>
-              <w:bottom w:val="single" w:sz="6" w:space="0" w:color="000000"/>
-              <w:right w:val="single" w:sz="6" w:space="0" w:color="000000"/>
-            </w:tcBorders>
-            <w:tcMar>
-              <w:top w:w="120" w:type="dxa"/>
-              <w:left w:w="120" w:type="dxa"/>
-              <w:bottom w:w="120" w:type="dxa"/>
-              <w:right w:w="120" w:type="dxa"/>
-            </w:tcMar>
-            <w:hideMark/>
-          </w:tcPr>
-          <w:p>
-            <w:r>
-              <w:t>[描述难点]</w:t>
-            </w:r>
-          </w:p>
-        </w:tc>
-        <w:tc>
-          <w:tcPr>
-            <w:tcW w:w="0" w:type="auto"/>
-            <w:tcBorders>
-              <w:top w:val="single" w:sz="6" w:space="0" w:color="000000"/>
-              <w:left w:val="single" w:sz="6" w:space="0" w:color="000000"/>
-              <w:bottom w:val="single" w:sz="6" w:space="0" w:color="000000"/>
-              <w:right w:val="single" w:sz="6" w:space="0" w:color="000000"/>
-            </w:tcBorders>
-            <w:tcMar>
-              <w:top w:w="120" w:type="dxa"/>
-              <w:left w:w="120" w:type="dxa"/>
-              <w:bottom w:w="120" w:type="dxa"/>
-              <w:right w:w="120" w:type="dxa"/>
-            </w:tcMar>
-            <w:hideMark/>
-          </w:tcPr>
-          <w:p>
-            <w:r>
-              <w:t>[描述思路]</w:t>
-            </w:r>
-          </w:p>
-        </w:tc>
-        <w:tc>
-          <w:tcPr>
-            <w:tcW w:w="0" w:type="auto"/>
-            <w:tcBorders>
-              <w:top w:val="single" w:sz="6" w:space="0" w:color="000000"/>
-              <w:left w:val="single" w:sz="6" w:space="0" w:color="000000"/>
-              <w:bottom w:val="single" w:sz="6" w:space="0" w:color="000000"/>
-              <w:right w:val="single" w:sz="6" w:space="0" w:color="000000"/>
-            </w:tcBorders>
-            <w:tcMar>
-              <w:top w:w="120" w:type="dxa"/>
-              <w:left w:w="120" w:type="dxa"/>
-              <w:bottom w:w="120" w:type="dxa"/>
-              <w:right w:w="120" w:type="dxa"/>
-            </w:tcMar>
-            <w:hideMark/>
-          </w:tcPr>
-          <w:p>
-            <w:r>
-              <w:t>[低/中/高]</w:t>
+        <w:trPr>
+          <w:trHeight w:val="817"/>
+        </w:trPr>
+        <w:tc>
+          <w:tcPr>
+            <w:tcW w:w="0" w:type="auto"/>
+            <w:tcBorders>
+              <w:top w:val="single" w:sz="6" w:space="0" w:color="auto"/>
+              <w:left w:val="single" w:sz="6" w:space="0" w:color="auto"/>
+              <w:bottom w:val="single" w:sz="6" w:space="0" w:color="auto"/>
+              <w:right w:val="single" w:sz="6" w:space="0" w:color="auto"/>
+            </w:tcBorders>
+            <w:shd w:val="clear" w:color="auto" w:fill="FFFFFF"/>
+            <w:tcMar>
+              <w:top w:w="150" w:type="dxa"/>
+              <w:left w:w="210" w:type="dxa"/>
+              <w:bottom w:w="150" w:type="dxa"/>
+              <w:right w:w="210" w:type="dxa"/>
+            </w:tcMar>
+            <w:vAlign w:val="center"/>
+            <w:hideMark/>
+          </w:tcPr>
+          <w:p>
+            <w:pPr>
+              <w:rPr>
+                <w:rFonts w:hint="eastAsia"/>
+                <w:sz w:val="18"/>
+                <w:szCs w:val="18"/>
+              </w:rPr>
+            </w:pPr>
+            <w:r>
+              <w:rPr>
+                <w:rFonts w:hint="eastAsia"/>
+                <w:sz w:val="18"/>
+                <w:szCs w:val="18"/>
+              </w:rPr>
+              <w:t>儿童语音识别准确率低（发音</w:t>
+            </w:r>
+            <w:proofErr w:type="gramStart"/>
+            <w:r>
+              <w:rPr>
+                <w:rFonts w:hint="eastAsia"/>
+                <w:sz w:val="18"/>
+                <w:szCs w:val="18"/>
+              </w:rPr>
+              <w:t>不</w:t>
+            </w:r>
+            <w:proofErr w:type="gramEnd"/>
+            <w:r>
+              <w:rPr>
+                <w:rFonts w:hint="eastAsia"/>
+                <w:sz w:val="18"/>
+                <w:szCs w:val="18"/>
+              </w:rPr>
+              <w:t>标准、语速不均，通用ASR识别率不足70%）</w:t>
+            </w:r>
+          </w:p>
+        </w:tc>
+        <w:tc>
+          <w:tcPr>
+            <w:tcW w:w="0" w:type="auto"/>
+            <w:tcBorders>
+              <w:top w:val="single" w:sz="6" w:space="0" w:color="auto"/>
+              <w:left w:val="single" w:sz="6" w:space="0" w:color="auto"/>
+              <w:bottom w:val="single" w:sz="6" w:space="0" w:color="auto"/>
+              <w:right w:val="single" w:sz="6" w:space="0" w:color="auto"/>
+            </w:tcBorders>
+            <w:shd w:val="clear" w:color="auto" w:fill="FFFFFF"/>
+            <w:tcMar>
+              <w:top w:w="150" w:type="dxa"/>
+              <w:left w:w="210" w:type="dxa"/>
+              <w:bottom w:w="150" w:type="dxa"/>
+              <w:right w:w="210" w:type="dxa"/>
+            </w:tcMar>
+            <w:vAlign w:val="center"/>
+            <w:hideMark/>
+          </w:tcPr>
+          <w:p>
+            <w:pPr>
+              <w:rPr>
+                <w:rFonts w:hint="eastAsia"/>
+                <w:sz w:val="18"/>
+                <w:szCs w:val="18"/>
+              </w:rPr>
+            </w:pPr>
+            <w:proofErr w:type="gramStart"/>
+            <w:r>
+              <w:rPr>
+                <w:rFonts w:hint="eastAsia"/>
+                <w:sz w:val="18"/>
+                <w:szCs w:val="18"/>
+              </w:rPr>
+              <w:t>采用讯飞</w:t>
+            </w:r>
+            <w:proofErr w:type="gramEnd"/>
+            <w:r>
+              <w:rPr>
+                <w:rFonts w:hint="eastAsia"/>
+                <w:sz w:val="18"/>
+                <w:szCs w:val="18"/>
+              </w:rPr>
+              <w:t>AIUI儿童专用语音模型（识别率&gt;92%）；引入</w:t>
+            </w:r>
+            <w:proofErr w:type="gramStart"/>
+            <w:r>
+              <w:rPr>
+                <w:rFonts w:hint="eastAsia"/>
+                <w:sz w:val="18"/>
+                <w:szCs w:val="18"/>
+              </w:rPr>
+              <w:t>启英泰</w:t>
+            </w:r>
+            <w:proofErr w:type="gramEnd"/>
+            <w:r>
+              <w:rPr>
+                <w:rFonts w:hint="eastAsia"/>
+                <w:sz w:val="18"/>
+                <w:szCs w:val="18"/>
+              </w:rPr>
+              <w:t>伦离线芯片处理简单指令；采用“简单指令离线处理+复杂对话走云端”的混合策略。</w:t>
+            </w:r>
+          </w:p>
+        </w:tc>
+        <w:tc>
+          <w:tcPr>
+            <w:tcW w:w="0" w:type="auto"/>
+            <w:tcBorders>
+              <w:top w:val="single" w:sz="6" w:space="0" w:color="auto"/>
+              <w:left w:val="single" w:sz="6" w:space="0" w:color="auto"/>
+              <w:bottom w:val="single" w:sz="6" w:space="0" w:color="auto"/>
+              <w:right w:val="single" w:sz="6" w:space="0" w:color="auto"/>
+            </w:tcBorders>
+            <w:shd w:val="clear" w:color="auto" w:fill="FFFFFF"/>
+            <w:tcMar>
+              <w:top w:w="150" w:type="dxa"/>
+              <w:left w:w="210" w:type="dxa"/>
+              <w:bottom w:w="150" w:type="dxa"/>
+              <w:right w:w="210" w:type="dxa"/>
+            </w:tcMar>
+            <w:vAlign w:val="center"/>
+            <w:hideMark/>
+          </w:tcPr>
+          <w:p>
+            <w:pPr>
+              <w:rPr>
+                <w:rFonts w:hint="eastAsia"/>
+                <w:sz w:val="18"/>
+                <w:szCs w:val="18"/>
+              </w:rPr>
+            </w:pPr>
+            <w:r>
+              <w:rPr>
+                <w:rFonts w:hint="eastAsia"/>
+                <w:sz w:val="18"/>
+                <w:szCs w:val="18"/>
+              </w:rPr>
+              <w:t>中</w:t>
+            </w:r>
+          </w:p>
+        </w:tc>
+      </w:tr>
+      <w:tr>
+        <w:tc>
+          <w:tcPr>
+            <w:tcW w:w="0" w:type="auto"/>
+            <w:tcBorders>
+              <w:top w:val="single" w:sz="6" w:space="0" w:color="auto"/>
+              <w:left w:val="single" w:sz="6" w:space="0" w:color="auto"/>
+              <w:bottom w:val="single" w:sz="6" w:space="0" w:color="auto"/>
+              <w:right w:val="single" w:sz="6" w:space="0" w:color="auto"/>
+            </w:tcBorders>
+            <w:shd w:val="clear" w:color="auto" w:fill="FFFFFF"/>
+            <w:tcMar>
+              <w:top w:w="150" w:type="dxa"/>
+              <w:left w:w="210" w:type="dxa"/>
+              <w:bottom w:w="150" w:type="dxa"/>
+              <w:right w:w="210" w:type="dxa"/>
+            </w:tcMar>
+            <w:vAlign w:val="center"/>
+            <w:hideMark/>
+          </w:tcPr>
+          <w:p>
+            <w:pPr>
+              <w:rPr>
+                <w:rFonts w:hint="eastAsia"/>
+                <w:sz w:val="18"/>
+                <w:szCs w:val="18"/>
+              </w:rPr>
+            </w:pPr>
+            <w:r>
+              <w:rPr>
+                <w:rFonts w:hint="eastAsia"/>
+                <w:sz w:val="18"/>
+                <w:szCs w:val="18"/>
+              </w:rPr>
+              <w:t>热敏打印只有黑白单色（无法打印彩色涂色页，产品吸引力下降）</w:t>
+            </w:r>
+          </w:p>
+        </w:tc>
+        <w:tc>
+          <w:tcPr>
+            <w:tcW w:w="0" w:type="auto"/>
+            <w:tcBorders>
+              <w:top w:val="single" w:sz="6" w:space="0" w:color="auto"/>
+              <w:left w:val="single" w:sz="6" w:space="0" w:color="auto"/>
+              <w:bottom w:val="single" w:sz="6" w:space="0" w:color="auto"/>
+              <w:right w:val="single" w:sz="6" w:space="0" w:color="auto"/>
+            </w:tcBorders>
+            <w:shd w:val="clear" w:color="auto" w:fill="FFFFFF"/>
+            <w:tcMar>
+              <w:top w:w="150" w:type="dxa"/>
+              <w:left w:w="210" w:type="dxa"/>
+              <w:bottom w:w="150" w:type="dxa"/>
+              <w:right w:w="210" w:type="dxa"/>
+            </w:tcMar>
+            <w:vAlign w:val="center"/>
+            <w:hideMark/>
+          </w:tcPr>
+          <w:p>
+            <w:pPr>
+              <w:rPr>
+                <w:rFonts w:hint="eastAsia"/>
+                <w:sz w:val="18"/>
+                <w:szCs w:val="18"/>
+              </w:rPr>
+            </w:pPr>
+            <w:r>
+              <w:rPr>
+                <w:rFonts w:hint="eastAsia"/>
+                <w:sz w:val="18"/>
+                <w:szCs w:val="18"/>
+              </w:rPr>
+              <w:t>采用高对比度线条稿（加粗轮廓+填充纹理），引导孩子通过手绘完成色彩环节；设计专门针对黑白打印优化的涂色模板。</w:t>
+            </w:r>
+          </w:p>
+        </w:tc>
+        <w:tc>
+          <w:tcPr>
+            <w:tcW w:w="0" w:type="auto"/>
+            <w:tcBorders>
+              <w:top w:val="single" w:sz="6" w:space="0" w:color="auto"/>
+              <w:left w:val="single" w:sz="6" w:space="0" w:color="auto"/>
+              <w:bottom w:val="single" w:sz="6" w:space="0" w:color="auto"/>
+              <w:right w:val="single" w:sz="6" w:space="0" w:color="auto"/>
+            </w:tcBorders>
+            <w:shd w:val="clear" w:color="auto" w:fill="FFFFFF"/>
+            <w:tcMar>
+              <w:top w:w="150" w:type="dxa"/>
+              <w:left w:w="210" w:type="dxa"/>
+              <w:bottom w:w="150" w:type="dxa"/>
+              <w:right w:w="210" w:type="dxa"/>
+            </w:tcMar>
+            <w:vAlign w:val="center"/>
+            <w:hideMark/>
+          </w:tcPr>
+          <w:p>
+            <w:pPr>
+              <w:rPr>
+                <w:rFonts w:hint="eastAsia"/>
+                <w:sz w:val="18"/>
+                <w:szCs w:val="18"/>
+              </w:rPr>
+            </w:pPr>
+            <w:r>
+              <w:rPr>
+                <w:rFonts w:hint="eastAsia"/>
+                <w:sz w:val="18"/>
+                <w:szCs w:val="18"/>
+              </w:rPr>
+              <w:t>中</w:t>
+            </w:r>
+          </w:p>
+        </w:tc>
+      </w:tr>
+      <w:tr>
+        <w:tc>
+          <w:tcPr>
+            <w:tcW w:w="0" w:type="auto"/>
+            <w:tcBorders>
+              <w:top w:val="single" w:sz="6" w:space="0" w:color="auto"/>
+              <w:left w:val="single" w:sz="6" w:space="0" w:color="auto"/>
+              <w:bottom w:val="single" w:sz="6" w:space="0" w:color="auto"/>
+              <w:right w:val="single" w:sz="6" w:space="0" w:color="auto"/>
+            </w:tcBorders>
+            <w:shd w:val="clear" w:color="auto" w:fill="FFFFFF"/>
+            <w:tcMar>
+              <w:top w:w="150" w:type="dxa"/>
+              <w:left w:w="210" w:type="dxa"/>
+              <w:bottom w:w="150" w:type="dxa"/>
+              <w:right w:w="210" w:type="dxa"/>
+            </w:tcMar>
+            <w:vAlign w:val="center"/>
+            <w:hideMark/>
+          </w:tcPr>
+          <w:p>
+            <w:pPr>
+              <w:rPr>
+                <w:rFonts w:hint="eastAsia"/>
+                <w:sz w:val="18"/>
+                <w:szCs w:val="18"/>
+              </w:rPr>
+            </w:pPr>
+            <w:r>
+              <w:rPr>
+                <w:rFonts w:hint="eastAsia"/>
+                <w:sz w:val="18"/>
+                <w:szCs w:val="18"/>
+              </w:rPr>
+              <w:lastRenderedPageBreak/>
+              <w:t>云端API延迟影响交互体验（ASR+LLM+文生图3次调用，总延迟可能&gt;10秒）</w:t>
+            </w:r>
+          </w:p>
+        </w:tc>
+        <w:tc>
+          <w:tcPr>
+            <w:tcW w:w="0" w:type="auto"/>
+            <w:tcBorders>
+              <w:top w:val="single" w:sz="6" w:space="0" w:color="auto"/>
+              <w:left w:val="single" w:sz="6" w:space="0" w:color="auto"/>
+              <w:bottom w:val="single" w:sz="6" w:space="0" w:color="auto"/>
+              <w:right w:val="single" w:sz="6" w:space="0" w:color="auto"/>
+            </w:tcBorders>
+            <w:shd w:val="clear" w:color="auto" w:fill="FFFFFF"/>
+            <w:tcMar>
+              <w:top w:w="150" w:type="dxa"/>
+              <w:left w:w="210" w:type="dxa"/>
+              <w:bottom w:w="150" w:type="dxa"/>
+              <w:right w:w="210" w:type="dxa"/>
+            </w:tcMar>
+            <w:vAlign w:val="center"/>
+            <w:hideMark/>
+          </w:tcPr>
+          <w:p>
+            <w:pPr>
+              <w:rPr>
+                <w:rFonts w:hint="eastAsia"/>
+                <w:sz w:val="18"/>
+                <w:szCs w:val="18"/>
+              </w:rPr>
+            </w:pPr>
+            <w:r>
+              <w:rPr>
+                <w:rFonts w:hint="eastAsia"/>
+                <w:sz w:val="18"/>
+                <w:szCs w:val="18"/>
+              </w:rPr>
+              <w:t>采用流式返回架构（语音识别后先反馈，图文后台并行生成）；本地缓存100+基础模板实现秒出；优选通义万</w:t>
+            </w:r>
+            <w:proofErr w:type="gramStart"/>
+            <w:r>
+              <w:rPr>
+                <w:rFonts w:hint="eastAsia"/>
+                <w:sz w:val="18"/>
+                <w:szCs w:val="18"/>
+              </w:rPr>
+              <w:t>相等低</w:t>
+            </w:r>
+            <w:proofErr w:type="gramEnd"/>
+            <w:r>
+              <w:rPr>
+                <w:rFonts w:hint="eastAsia"/>
+                <w:sz w:val="18"/>
+                <w:szCs w:val="18"/>
+              </w:rPr>
+              <w:t>延迟模型。</w:t>
+            </w:r>
+          </w:p>
+        </w:tc>
+        <w:tc>
+          <w:tcPr>
+            <w:tcW w:w="0" w:type="auto"/>
+            <w:tcBorders>
+              <w:top w:val="single" w:sz="6" w:space="0" w:color="auto"/>
+              <w:left w:val="single" w:sz="6" w:space="0" w:color="auto"/>
+              <w:bottom w:val="single" w:sz="6" w:space="0" w:color="auto"/>
+              <w:right w:val="single" w:sz="6" w:space="0" w:color="auto"/>
+            </w:tcBorders>
+            <w:shd w:val="clear" w:color="auto" w:fill="FFFFFF"/>
+            <w:tcMar>
+              <w:top w:w="150" w:type="dxa"/>
+              <w:left w:w="210" w:type="dxa"/>
+              <w:bottom w:w="150" w:type="dxa"/>
+              <w:right w:w="210" w:type="dxa"/>
+            </w:tcMar>
+            <w:vAlign w:val="center"/>
+            <w:hideMark/>
+          </w:tcPr>
+          <w:p>
+            <w:pPr>
+              <w:rPr>
+                <w:rFonts w:hint="eastAsia"/>
+                <w:sz w:val="18"/>
+                <w:szCs w:val="18"/>
+              </w:rPr>
+            </w:pPr>
+            <w:r>
+              <w:rPr>
+                <w:rFonts w:hint="eastAsia"/>
+                <w:sz w:val="18"/>
+                <w:szCs w:val="18"/>
+              </w:rPr>
+              <w:t>中</w:t>
+            </w:r>
+          </w:p>
+        </w:tc>
+      </w:tr>
+      <w:tr>
+        <w:tc>
+          <w:tcPr>
+            <w:tcW w:w="0" w:type="auto"/>
+            <w:tcBorders>
+              <w:top w:val="single" w:sz="6" w:space="0" w:color="auto"/>
+              <w:left w:val="single" w:sz="6" w:space="0" w:color="auto"/>
+              <w:bottom w:val="single" w:sz="6" w:space="0" w:color="auto"/>
+              <w:right w:val="single" w:sz="6" w:space="0" w:color="auto"/>
+            </w:tcBorders>
+            <w:shd w:val="clear" w:color="auto" w:fill="FFFFFF"/>
+            <w:tcMar>
+              <w:top w:w="150" w:type="dxa"/>
+              <w:left w:w="210" w:type="dxa"/>
+              <w:bottom w:w="150" w:type="dxa"/>
+              <w:right w:w="210" w:type="dxa"/>
+            </w:tcMar>
+            <w:vAlign w:val="center"/>
+            <w:hideMark/>
+          </w:tcPr>
+          <w:p>
+            <w:pPr>
+              <w:rPr>
+                <w:rFonts w:hint="eastAsia"/>
+                <w:sz w:val="18"/>
+                <w:szCs w:val="18"/>
+              </w:rPr>
+            </w:pPr>
+            <w:proofErr w:type="gramStart"/>
+            <w:r>
+              <w:rPr>
+                <w:rFonts w:hint="eastAsia"/>
+                <w:sz w:val="18"/>
+                <w:szCs w:val="18"/>
+              </w:rPr>
+              <w:t>端侧算力</w:t>
+            </w:r>
+            <w:proofErr w:type="gramEnd"/>
+            <w:r>
+              <w:rPr>
+                <w:rFonts w:hint="eastAsia"/>
+                <w:sz w:val="18"/>
+                <w:szCs w:val="18"/>
+              </w:rPr>
+              <w:t>有限（全志V3s仅128MB内存，无法运行大模型）</w:t>
+            </w:r>
+          </w:p>
+        </w:tc>
+        <w:tc>
+          <w:tcPr>
+            <w:tcW w:w="0" w:type="auto"/>
+            <w:tcBorders>
+              <w:top w:val="single" w:sz="6" w:space="0" w:color="auto"/>
+              <w:left w:val="single" w:sz="6" w:space="0" w:color="auto"/>
+              <w:bottom w:val="single" w:sz="6" w:space="0" w:color="auto"/>
+              <w:right w:val="single" w:sz="6" w:space="0" w:color="auto"/>
+            </w:tcBorders>
+            <w:shd w:val="clear" w:color="auto" w:fill="FFFFFF"/>
+            <w:tcMar>
+              <w:top w:w="150" w:type="dxa"/>
+              <w:left w:w="210" w:type="dxa"/>
+              <w:bottom w:w="150" w:type="dxa"/>
+              <w:right w:w="210" w:type="dxa"/>
+            </w:tcMar>
+            <w:vAlign w:val="center"/>
+            <w:hideMark/>
+          </w:tcPr>
+          <w:p>
+            <w:pPr>
+              <w:rPr>
+                <w:rFonts w:hint="eastAsia"/>
+                <w:sz w:val="18"/>
+                <w:szCs w:val="18"/>
+              </w:rPr>
+            </w:pPr>
+            <w:proofErr w:type="gramStart"/>
+            <w:r>
+              <w:rPr>
+                <w:rFonts w:hint="eastAsia"/>
+                <w:sz w:val="18"/>
+                <w:szCs w:val="18"/>
+              </w:rPr>
+              <w:t>明确端云</w:t>
+            </w:r>
+            <w:proofErr w:type="gramEnd"/>
+            <w:r>
+              <w:rPr>
+                <w:rFonts w:hint="eastAsia"/>
+                <w:sz w:val="18"/>
+                <w:szCs w:val="18"/>
+              </w:rPr>
+              <w:t>分工：</w:t>
+            </w:r>
+            <w:proofErr w:type="gramStart"/>
+            <w:r>
+              <w:rPr>
+                <w:rFonts w:hint="eastAsia"/>
+                <w:sz w:val="18"/>
+                <w:szCs w:val="18"/>
+              </w:rPr>
+              <w:t>端侧只做</w:t>
+            </w:r>
+            <w:proofErr w:type="gramEnd"/>
+            <w:r>
+              <w:rPr>
+                <w:rFonts w:hint="eastAsia"/>
+                <w:sz w:val="18"/>
+                <w:szCs w:val="18"/>
+              </w:rPr>
+              <w:t>音频采集、图像渲染与打印控制，所有AI计算均在云端完成；配合本地缓存策略减少重复请求。</w:t>
+            </w:r>
+          </w:p>
+        </w:tc>
+        <w:tc>
+          <w:tcPr>
+            <w:tcW w:w="0" w:type="auto"/>
+            <w:tcBorders>
+              <w:top w:val="single" w:sz="6" w:space="0" w:color="auto"/>
+              <w:left w:val="single" w:sz="6" w:space="0" w:color="auto"/>
+              <w:bottom w:val="single" w:sz="6" w:space="0" w:color="auto"/>
+              <w:right w:val="single" w:sz="6" w:space="0" w:color="auto"/>
+            </w:tcBorders>
+            <w:shd w:val="clear" w:color="auto" w:fill="FFFFFF"/>
+            <w:tcMar>
+              <w:top w:w="150" w:type="dxa"/>
+              <w:left w:w="210" w:type="dxa"/>
+              <w:bottom w:w="150" w:type="dxa"/>
+              <w:right w:w="210" w:type="dxa"/>
+            </w:tcMar>
+            <w:vAlign w:val="center"/>
+            <w:hideMark/>
+          </w:tcPr>
+          <w:p>
+            <w:pPr>
+              <w:rPr>
+                <w:rFonts w:hint="eastAsia"/>
+                <w:sz w:val="18"/>
+                <w:szCs w:val="18"/>
+              </w:rPr>
+            </w:pPr>
+            <w:r>
+              <w:rPr>
+                <w:rFonts w:hint="eastAsia"/>
+                <w:sz w:val="18"/>
+                <w:szCs w:val="18"/>
+              </w:rPr>
+              <w:t>低</w:t>
+            </w:r>
+          </w:p>
+        </w:tc>
+      </w:tr>
+      <w:tr>
+        <w:tc>
+          <w:tcPr>
+            <w:tcW w:w="0" w:type="auto"/>
+            <w:tcBorders>
+              <w:top w:val="single" w:sz="6" w:space="0" w:color="auto"/>
+              <w:left w:val="single" w:sz="6" w:space="0" w:color="auto"/>
+              <w:bottom w:val="single" w:sz="6" w:space="0" w:color="auto"/>
+              <w:right w:val="single" w:sz="6" w:space="0" w:color="auto"/>
+            </w:tcBorders>
+            <w:shd w:val="clear" w:color="auto" w:fill="FFFFFF"/>
+            <w:tcMar>
+              <w:top w:w="150" w:type="dxa"/>
+              <w:left w:w="210" w:type="dxa"/>
+              <w:bottom w:w="150" w:type="dxa"/>
+              <w:right w:w="210" w:type="dxa"/>
+            </w:tcMar>
+            <w:vAlign w:val="center"/>
+            <w:hideMark/>
+          </w:tcPr>
+          <w:p>
+            <w:pPr>
+              <w:rPr>
+                <w:rFonts w:hint="eastAsia"/>
+                <w:sz w:val="18"/>
+                <w:szCs w:val="18"/>
+              </w:rPr>
+            </w:pPr>
+            <w:r>
+              <w:rPr>
+                <w:rFonts w:hint="eastAsia"/>
+                <w:sz w:val="18"/>
+                <w:szCs w:val="18"/>
+              </w:rPr>
+              <w:t>离线场景功能受限（无网络时AI能力完全</w:t>
+            </w:r>
+            <w:proofErr w:type="gramStart"/>
+            <w:r>
+              <w:rPr>
+                <w:rFonts w:hint="eastAsia"/>
+                <w:sz w:val="18"/>
+                <w:szCs w:val="18"/>
+              </w:rPr>
+              <w:t>不</w:t>
+            </w:r>
+            <w:proofErr w:type="gramEnd"/>
+            <w:r>
+              <w:rPr>
+                <w:rFonts w:hint="eastAsia"/>
+                <w:sz w:val="18"/>
+                <w:szCs w:val="18"/>
+              </w:rPr>
+              <w:t>可用）</w:t>
+            </w:r>
+          </w:p>
+        </w:tc>
+        <w:tc>
+          <w:tcPr>
+            <w:tcW w:w="0" w:type="auto"/>
+            <w:tcBorders>
+              <w:top w:val="single" w:sz="6" w:space="0" w:color="auto"/>
+              <w:left w:val="single" w:sz="6" w:space="0" w:color="auto"/>
+              <w:bottom w:val="single" w:sz="6" w:space="0" w:color="auto"/>
+              <w:right w:val="single" w:sz="6" w:space="0" w:color="auto"/>
+            </w:tcBorders>
+            <w:shd w:val="clear" w:color="auto" w:fill="FFFFFF"/>
+            <w:tcMar>
+              <w:top w:w="150" w:type="dxa"/>
+              <w:left w:w="210" w:type="dxa"/>
+              <w:bottom w:w="150" w:type="dxa"/>
+              <w:right w:w="210" w:type="dxa"/>
+            </w:tcMar>
+            <w:vAlign w:val="center"/>
+            <w:hideMark/>
+          </w:tcPr>
+          <w:p>
+            <w:pPr>
+              <w:rPr>
+                <w:rFonts w:hint="eastAsia"/>
+                <w:sz w:val="18"/>
+                <w:szCs w:val="18"/>
+              </w:rPr>
+            </w:pPr>
+            <w:r>
+              <w:rPr>
+                <w:rFonts w:hint="eastAsia"/>
+                <w:sz w:val="18"/>
+                <w:szCs w:val="18"/>
+              </w:rPr>
+              <w:t>预装100+本地模板库支持离线基础打印；家长APP支持预先下载模板包；产品定位引导用户在有</w:t>
+            </w:r>
+            <w:proofErr w:type="spellStart"/>
+            <w:r>
+              <w:rPr>
+                <w:rFonts w:hint="eastAsia"/>
+                <w:sz w:val="18"/>
+                <w:szCs w:val="18"/>
+              </w:rPr>
+              <w:t>WiFi</w:t>
+            </w:r>
+            <w:proofErr w:type="spellEnd"/>
+            <w:r>
+              <w:rPr>
+                <w:rFonts w:hint="eastAsia"/>
+                <w:sz w:val="18"/>
+                <w:szCs w:val="18"/>
+              </w:rPr>
+              <w:t>环境下使用。</w:t>
+            </w:r>
+          </w:p>
+        </w:tc>
+        <w:tc>
+          <w:tcPr>
+            <w:tcW w:w="0" w:type="auto"/>
+            <w:tcBorders>
+              <w:top w:val="single" w:sz="6" w:space="0" w:color="auto"/>
+              <w:left w:val="single" w:sz="6" w:space="0" w:color="auto"/>
+              <w:bottom w:val="single" w:sz="6" w:space="0" w:color="auto"/>
+              <w:right w:val="single" w:sz="6" w:space="0" w:color="auto"/>
+            </w:tcBorders>
+            <w:shd w:val="clear" w:color="auto" w:fill="FFFFFF"/>
+            <w:tcMar>
+              <w:top w:w="150" w:type="dxa"/>
+              <w:left w:w="210" w:type="dxa"/>
+              <w:bottom w:w="150" w:type="dxa"/>
+              <w:right w:w="210" w:type="dxa"/>
+            </w:tcMar>
+            <w:vAlign w:val="center"/>
+            <w:hideMark/>
+          </w:tcPr>
+          <w:p>
+            <w:pPr>
+              <w:rPr>
+                <w:rFonts w:hint="eastAsia"/>
+                <w:sz w:val="18"/>
+                <w:szCs w:val="18"/>
+              </w:rPr>
+            </w:pPr>
+            <w:r>
+              <w:rPr>
+                <w:rFonts w:hint="eastAsia"/>
+                <w:sz w:val="18"/>
+                <w:szCs w:val="18"/>
+              </w:rPr>
+              <w:t>中</w:t>
+            </w:r>
+          </w:p>
+        </w:tc>
+      </w:tr>
+      <w:tr>
+        <w:tc>
+          <w:tcPr>
+            <w:tcW w:w="0" w:type="auto"/>
+            <w:tcBorders>
+              <w:top w:val="single" w:sz="6" w:space="0" w:color="auto"/>
+              <w:left w:val="single" w:sz="6" w:space="0" w:color="auto"/>
+              <w:bottom w:val="single" w:sz="6" w:space="0" w:color="auto"/>
+              <w:right w:val="single" w:sz="6" w:space="0" w:color="auto"/>
+            </w:tcBorders>
+            <w:shd w:val="clear" w:color="auto" w:fill="FFFFFF"/>
+            <w:tcMar>
+              <w:top w:w="150" w:type="dxa"/>
+              <w:left w:w="210" w:type="dxa"/>
+              <w:bottom w:w="150" w:type="dxa"/>
+              <w:right w:w="210" w:type="dxa"/>
+            </w:tcMar>
+            <w:vAlign w:val="center"/>
+            <w:hideMark/>
+          </w:tcPr>
+          <w:p>
+            <w:pPr>
+              <w:rPr>
+                <w:rFonts w:hint="eastAsia"/>
+                <w:sz w:val="18"/>
+                <w:szCs w:val="18"/>
+              </w:rPr>
+            </w:pPr>
+            <w:r>
+              <w:rPr>
+                <w:rFonts w:hint="eastAsia"/>
+                <w:sz w:val="18"/>
+                <w:szCs w:val="18"/>
+              </w:rPr>
+              <w:t>内容安全与儿童保护（AI生成内容不可控，可能出现不适宜信息）</w:t>
+            </w:r>
+          </w:p>
+        </w:tc>
+        <w:tc>
+          <w:tcPr>
+            <w:tcW w:w="0" w:type="auto"/>
+            <w:tcBorders>
+              <w:top w:val="single" w:sz="6" w:space="0" w:color="auto"/>
+              <w:left w:val="single" w:sz="6" w:space="0" w:color="auto"/>
+              <w:bottom w:val="single" w:sz="6" w:space="0" w:color="auto"/>
+              <w:right w:val="single" w:sz="6" w:space="0" w:color="auto"/>
+            </w:tcBorders>
+            <w:shd w:val="clear" w:color="auto" w:fill="FFFFFF"/>
+            <w:tcMar>
+              <w:top w:w="150" w:type="dxa"/>
+              <w:left w:w="210" w:type="dxa"/>
+              <w:bottom w:w="150" w:type="dxa"/>
+              <w:right w:w="210" w:type="dxa"/>
+            </w:tcMar>
+            <w:vAlign w:val="center"/>
+            <w:hideMark/>
+          </w:tcPr>
+          <w:p>
+            <w:pPr>
+              <w:rPr>
+                <w:rFonts w:hint="eastAsia"/>
+                <w:sz w:val="18"/>
+                <w:szCs w:val="18"/>
+              </w:rPr>
+            </w:pPr>
+            <w:r>
+              <w:rPr>
+                <w:rFonts w:hint="eastAsia"/>
+                <w:sz w:val="18"/>
+                <w:szCs w:val="18"/>
+              </w:rPr>
+              <w:t xml:space="preserve">建立三级审核机制：云端API内置安全过滤 + </w:t>
+            </w:r>
+            <w:proofErr w:type="gramStart"/>
+            <w:r>
+              <w:rPr>
+                <w:rFonts w:hint="eastAsia"/>
+                <w:sz w:val="18"/>
+                <w:szCs w:val="18"/>
+              </w:rPr>
+              <w:t>端侧基础</w:t>
+            </w:r>
+            <w:proofErr w:type="gramEnd"/>
+            <w:r>
+              <w:rPr>
+                <w:rFonts w:hint="eastAsia"/>
+                <w:sz w:val="18"/>
+                <w:szCs w:val="18"/>
+              </w:rPr>
+              <w:t>过滤（关键词+图像特征）+ 家长APP内容白名单；生成记录全程可追溯。</w:t>
+            </w:r>
+          </w:p>
+        </w:tc>
+        <w:tc>
+          <w:tcPr>
+            <w:tcW w:w="0" w:type="auto"/>
+            <w:tcBorders>
+              <w:top w:val="single" w:sz="6" w:space="0" w:color="auto"/>
+              <w:left w:val="single" w:sz="6" w:space="0" w:color="auto"/>
+              <w:bottom w:val="single" w:sz="6" w:space="0" w:color="auto"/>
+              <w:right w:val="single" w:sz="6" w:space="0" w:color="auto"/>
+            </w:tcBorders>
+            <w:shd w:val="clear" w:color="auto" w:fill="FFFFFF"/>
+            <w:tcMar>
+              <w:top w:w="150" w:type="dxa"/>
+              <w:left w:w="210" w:type="dxa"/>
+              <w:bottom w:w="150" w:type="dxa"/>
+              <w:right w:w="210" w:type="dxa"/>
+            </w:tcMar>
+            <w:vAlign w:val="center"/>
+            <w:hideMark/>
+          </w:tcPr>
+          <w:p>
+            <w:pPr>
+              <w:rPr>
+                <w:rFonts w:hint="eastAsia"/>
+                <w:sz w:val="18"/>
+                <w:szCs w:val="18"/>
+              </w:rPr>
+            </w:pPr>
+            <w:r>
+              <w:rPr>
+                <w:rFonts w:hint="eastAsia"/>
+                <w:sz w:val="18"/>
+                <w:szCs w:val="18"/>
+              </w:rPr>
+              <w:t>高</w:t>
+            </w:r>
+          </w:p>
+        </w:tc>
+      </w:tr>
+      <w:tr>
+        <w:tc>
+          <w:tcPr>
+            <w:tcW w:w="0" w:type="auto"/>
+            <w:tcBorders>
+              <w:top w:val="single" w:sz="6" w:space="0" w:color="auto"/>
+              <w:left w:val="single" w:sz="6" w:space="0" w:color="auto"/>
+              <w:bottom w:val="single" w:sz="6" w:space="0" w:color="auto"/>
+              <w:right w:val="single" w:sz="6" w:space="0" w:color="auto"/>
+            </w:tcBorders>
+            <w:shd w:val="clear" w:color="auto" w:fill="FFFFFF"/>
+            <w:tcMar>
+              <w:top w:w="150" w:type="dxa"/>
+              <w:left w:w="210" w:type="dxa"/>
+              <w:bottom w:w="150" w:type="dxa"/>
+              <w:right w:w="210" w:type="dxa"/>
+            </w:tcMar>
+            <w:vAlign w:val="center"/>
+            <w:hideMark/>
+          </w:tcPr>
+          <w:p>
+            <w:pPr>
+              <w:rPr>
+                <w:rFonts w:hint="eastAsia"/>
+                <w:sz w:val="18"/>
+                <w:szCs w:val="18"/>
+              </w:rPr>
+            </w:pPr>
+            <w:r>
+              <w:rPr>
+                <w:rFonts w:hint="eastAsia"/>
+                <w:sz w:val="18"/>
+                <w:szCs w:val="18"/>
+              </w:rPr>
+              <w:t>婴儿哭声/环境噪声误唤醒（语音唤醒芯片对环境噪声敏感）</w:t>
+            </w:r>
+          </w:p>
+        </w:tc>
+        <w:tc>
+          <w:tcPr>
+            <w:tcW w:w="0" w:type="auto"/>
+            <w:tcBorders>
+              <w:top w:val="single" w:sz="6" w:space="0" w:color="auto"/>
+              <w:left w:val="single" w:sz="6" w:space="0" w:color="auto"/>
+              <w:bottom w:val="single" w:sz="6" w:space="0" w:color="auto"/>
+              <w:right w:val="single" w:sz="6" w:space="0" w:color="auto"/>
+            </w:tcBorders>
+            <w:shd w:val="clear" w:color="auto" w:fill="FFFFFF"/>
+            <w:tcMar>
+              <w:top w:w="150" w:type="dxa"/>
+              <w:left w:w="210" w:type="dxa"/>
+              <w:bottom w:w="150" w:type="dxa"/>
+              <w:right w:w="210" w:type="dxa"/>
+            </w:tcMar>
+            <w:vAlign w:val="center"/>
+            <w:hideMark/>
+          </w:tcPr>
+          <w:p>
+            <w:pPr>
+              <w:rPr>
+                <w:rFonts w:hint="eastAsia"/>
+                <w:sz w:val="18"/>
+                <w:szCs w:val="18"/>
+              </w:rPr>
+            </w:pPr>
+            <w:r>
+              <w:rPr>
+                <w:rFonts w:hint="eastAsia"/>
+                <w:sz w:val="18"/>
+                <w:szCs w:val="18"/>
+              </w:rPr>
+              <w:t>采用</w:t>
+            </w:r>
+            <w:proofErr w:type="gramStart"/>
+            <w:r>
+              <w:rPr>
+                <w:rFonts w:hint="eastAsia"/>
+                <w:sz w:val="18"/>
+                <w:szCs w:val="18"/>
+              </w:rPr>
+              <w:t>启英泰</w:t>
+            </w:r>
+            <w:proofErr w:type="gramEnd"/>
+            <w:r>
+              <w:rPr>
+                <w:rFonts w:hint="eastAsia"/>
+                <w:sz w:val="18"/>
+                <w:szCs w:val="18"/>
+              </w:rPr>
+              <w:t>伦CI130x芯片支持自定义唤醒词与声纹能量检测；增加物理按键唤醒模式作为备选；屏幕实时显示唤醒状态。</w:t>
+            </w:r>
+          </w:p>
+        </w:tc>
+        <w:tc>
+          <w:tcPr>
+            <w:tcW w:w="0" w:type="auto"/>
+            <w:tcBorders>
+              <w:top w:val="single" w:sz="6" w:space="0" w:color="auto"/>
+              <w:left w:val="single" w:sz="6" w:space="0" w:color="auto"/>
+              <w:bottom w:val="single" w:sz="6" w:space="0" w:color="auto"/>
+              <w:right w:val="single" w:sz="6" w:space="0" w:color="auto"/>
+            </w:tcBorders>
+            <w:shd w:val="clear" w:color="auto" w:fill="FFFFFF"/>
+            <w:tcMar>
+              <w:top w:w="150" w:type="dxa"/>
+              <w:left w:w="210" w:type="dxa"/>
+              <w:bottom w:w="150" w:type="dxa"/>
+              <w:right w:w="210" w:type="dxa"/>
+            </w:tcMar>
+            <w:vAlign w:val="center"/>
+            <w:hideMark/>
+          </w:tcPr>
+          <w:p>
+            <w:pPr>
+              <w:rPr>
+                <w:rFonts w:hint="eastAsia"/>
+                <w:sz w:val="18"/>
+                <w:szCs w:val="18"/>
+              </w:rPr>
+            </w:pPr>
+            <w:r>
+              <w:rPr>
+                <w:rFonts w:hint="eastAsia"/>
+                <w:sz w:val="18"/>
+                <w:szCs w:val="18"/>
+              </w:rPr>
+              <w:t>低</w:t>
+            </w:r>
+          </w:p>
+        </w:tc>
+      </w:tr>
+      <w:tr>
+        <w:tc>
+          <w:tcPr>
+            <w:tcW w:w="0" w:type="auto"/>
+            <w:tcBorders>
+              <w:top w:val="single" w:sz="6" w:space="0" w:color="auto"/>
+              <w:left w:val="single" w:sz="6" w:space="0" w:color="auto"/>
+              <w:bottom w:val="single" w:sz="6" w:space="0" w:color="auto"/>
+              <w:right w:val="single" w:sz="6" w:space="0" w:color="auto"/>
+            </w:tcBorders>
+            <w:shd w:val="clear" w:color="auto" w:fill="FFFFFF"/>
+            <w:tcMar>
+              <w:top w:w="150" w:type="dxa"/>
+              <w:left w:w="210" w:type="dxa"/>
+              <w:bottom w:w="150" w:type="dxa"/>
+              <w:right w:w="210" w:type="dxa"/>
+            </w:tcMar>
+            <w:vAlign w:val="center"/>
+            <w:hideMark/>
+          </w:tcPr>
+          <w:p>
+            <w:pPr>
+              <w:rPr>
+                <w:rFonts w:hint="eastAsia"/>
+                <w:sz w:val="18"/>
+                <w:szCs w:val="18"/>
+              </w:rPr>
+            </w:pPr>
+            <w:r>
+              <w:rPr>
+                <w:rFonts w:hint="eastAsia"/>
+                <w:sz w:val="18"/>
+                <w:szCs w:val="18"/>
+              </w:rPr>
+              <w:t>供应链稳定性与成本控制（核心物料可能涨价或缺货）</w:t>
+            </w:r>
+          </w:p>
+        </w:tc>
+        <w:tc>
+          <w:tcPr>
+            <w:tcW w:w="0" w:type="auto"/>
+            <w:tcBorders>
+              <w:top w:val="single" w:sz="6" w:space="0" w:color="auto"/>
+              <w:left w:val="single" w:sz="6" w:space="0" w:color="auto"/>
+              <w:bottom w:val="single" w:sz="6" w:space="0" w:color="auto"/>
+              <w:right w:val="single" w:sz="6" w:space="0" w:color="auto"/>
+            </w:tcBorders>
+            <w:shd w:val="clear" w:color="auto" w:fill="FFFFFF"/>
+            <w:tcMar>
+              <w:top w:w="150" w:type="dxa"/>
+              <w:left w:w="210" w:type="dxa"/>
+              <w:bottom w:w="150" w:type="dxa"/>
+              <w:right w:w="210" w:type="dxa"/>
+            </w:tcMar>
+            <w:vAlign w:val="center"/>
+            <w:hideMark/>
+          </w:tcPr>
+          <w:p>
+            <w:pPr>
+              <w:rPr>
+                <w:rFonts w:hint="eastAsia"/>
+                <w:sz w:val="18"/>
+                <w:szCs w:val="18"/>
+              </w:rPr>
+            </w:pPr>
+            <w:r>
+              <w:rPr>
+                <w:rFonts w:hint="eastAsia"/>
+                <w:sz w:val="18"/>
+                <w:szCs w:val="18"/>
+              </w:rPr>
+              <w:t>核心物料（打印模组、主控）均储备至少2家供应商；首批订单锁定价格；BOM设计预留替换兼容接口。</w:t>
+            </w:r>
+          </w:p>
+        </w:tc>
+        <w:tc>
+          <w:tcPr>
+            <w:tcW w:w="0" w:type="auto"/>
+            <w:tcBorders>
+              <w:top w:val="single" w:sz="6" w:space="0" w:color="auto"/>
+              <w:left w:val="single" w:sz="6" w:space="0" w:color="auto"/>
+              <w:bottom w:val="single" w:sz="6" w:space="0" w:color="auto"/>
+              <w:right w:val="single" w:sz="6" w:space="0" w:color="auto"/>
+            </w:tcBorders>
+            <w:shd w:val="clear" w:color="auto" w:fill="FFFFFF"/>
+            <w:tcMar>
+              <w:top w:w="150" w:type="dxa"/>
+              <w:left w:w="210" w:type="dxa"/>
+              <w:bottom w:w="150" w:type="dxa"/>
+              <w:right w:w="210" w:type="dxa"/>
+            </w:tcMar>
+            <w:vAlign w:val="center"/>
+            <w:hideMark/>
+          </w:tcPr>
+          <w:p>
+            <w:pPr>
+              <w:rPr>
+                <w:rFonts w:hint="eastAsia"/>
+                <w:sz w:val="18"/>
+                <w:szCs w:val="18"/>
+              </w:rPr>
+            </w:pPr>
+            <w:r>
+              <w:rPr>
+                <w:rFonts w:hint="eastAsia"/>
+                <w:sz w:val="18"/>
+                <w:szCs w:val="18"/>
+              </w:rPr>
+              <w:t>高</w:t>
             </w:r>
           </w:p>
         </w:tc>
       </w:tr>
     </w:tbl>
+    <w:p>
+      <w:pPr>
+        <w:rPr>
+          <w:b/>
+          <w:bCs/>
+        </w:rPr>
+      </w:pPr>
+    </w:p>
     <w:p>
       <w:pPr>
         <w:rPr>
@@ -885,7 +2230,6 @@
               </w:rPr>
             </w:pPr>
             <w:r>
-              <w:lastRenderedPageBreak/>
               <w:t>阶段</w:t>
             </w:r>
           </w:p>
@@ -1408,7 +2752,7 @@
       <w:tblGrid>
         <w:gridCol w:w="2760"/>
         <w:gridCol w:w="1518"/>
-        <w:gridCol w:w="3198"/>
+        <w:gridCol w:w="3977"/>
       </w:tblGrid>
       <w:tr>
         <w:trPr>
@@ -1440,6 +2784,7 @@
               </w:rPr>
             </w:pPr>
             <w:r>
+              <w:lastRenderedPageBreak/>
               <w:t>项目阶段</w:t>
             </w:r>
           </w:p>
@@ -1573,7 +2918,42 @@
             </w:tcMar>
             <w:hideMark/>
           </w:tcPr>
-          <w:p/>
+          <w:p>
+            <w:pPr>
+              <w:rPr>
+                <w:rFonts w:hint="eastAsia"/>
+              </w:rPr>
+            </w:pPr>
+            <w:r>
+              <w:rPr>
+                <w:rFonts w:hint="eastAsia"/>
+              </w:rPr>
+              <w:t>用户访谈、</w:t>
+            </w:r>
+            <w:proofErr w:type="gramStart"/>
+            <w:r>
+              <w:rPr>
+                <w:rFonts w:hint="eastAsia"/>
+              </w:rPr>
+              <w:t>竞品样品</w:t>
+            </w:r>
+            <w:proofErr w:type="gramEnd"/>
+            <w:r>
+              <w:rPr>
+                <w:rFonts w:hint="eastAsia"/>
+              </w:rPr>
+              <w:t>采购</w:t>
+            </w:r>
+            <w:r>
+              <w:br/>
+            </w:r>
+            <w:r>
+              <w:rPr>
+                <w:rFonts w:hint="eastAsia"/>
+              </w:rPr>
+              <w:t>外观概念图初稿</w:t>
+            </w:r>
+          </w:p>
         </w:tc>
       </w:tr>
       <w:tr>
@@ -1636,6 +3016,77 @@
             </w:tcMar>
             <w:hideMark/>
           </w:tcPr>
+          <w:p>
+            <w:pPr>
+              <w:rPr>
+                <w:rFonts w:hint="eastAsia"/>
+              </w:rPr>
+            </w:pPr>
+            <w:r>
+              <w:rPr>
+                <w:rFonts w:hint="eastAsia"/>
+              </w:rPr>
+              <w:t>PCB打样×2轮、元器件采购、调试工具</w:t>
+            </w:r>
+            <w:r>
+              <w:br/>
+            </w:r>
+            <w:r>
+              <w:rPr>
+                <w:rFonts w:hint="eastAsia"/>
+              </w:rPr>
+              <w:t>外壳注塑开模（钢模）</w:t>
+            </w:r>
+            <w:r>
+              <w:br/>
+            </w:r>
+            <w:r>
+              <w:rPr>
+                <w:rFonts w:hint="eastAsia"/>
+              </w:rPr>
+              <w:t>BOM采购</w:t>
+            </w:r>
+            <w:r>
+              <w:br/>
+            </w:r>
+            <w:r>
+              <w:rPr>
+                <w:rFonts w:hint="eastAsia"/>
+              </w:rPr>
+              <w:t>通义</w:t>
+            </w:r>
+            <w:proofErr w:type="gramStart"/>
+            <w:r>
+              <w:rPr>
+                <w:rFonts w:hint="eastAsia"/>
+              </w:rPr>
+              <w:t>万相+讯飞</w:t>
+            </w:r>
+            <w:proofErr w:type="gramEnd"/>
+            <w:r>
+              <w:rPr>
+                <w:rFonts w:hint="eastAsia"/>
+              </w:rPr>
+              <w:t>AIUI API调用、云服务器</w:t>
+            </w:r>
+            <w:r>
+              <w:br/>
+            </w:r>
+            <w:r>
+              <w:rPr>
+                <w:rFonts w:hint="eastAsia"/>
+              </w:rPr>
+              <w:t xml:space="preserve">嵌入式固件 + 后端API + </w:t>
+            </w:r>
+            <w:proofErr w:type="gramStart"/>
+            <w:r>
+              <w:rPr>
+                <w:rFonts w:hint="eastAsia"/>
+              </w:rPr>
+              <w:t>家长端小程序</w:t>
+            </w:r>
+            <w:proofErr w:type="gramEnd"/>
+          </w:p>
           <w:p/>
         </w:tc>
       </w:tr>
@@ -1699,7 +3150,59 @@
             </w:tcMar>
             <w:hideMark/>
           </w:tcPr>
-          <w:p/>
+          <w:p>
+            <w:r>
+              <w:rPr>
+                <w:rFonts w:hint="eastAsia"/>
+              </w:rPr>
+              <w:t>BOM采购</w:t>
+            </w:r>
+          </w:p>
+          <w:p>
+            <w:r>
+              <w:rPr>
+                <w:rFonts w:hint="eastAsia"/>
+              </w:rPr>
+              <w:t>SMT+组装</w:t>
+            </w:r>
+          </w:p>
+          <w:p>
+            <w:r>
+              <w:rPr>
+                <w:rFonts w:hint="eastAsia"/>
+              </w:rPr>
+              <w:t>API调用+服务器费用</w:t>
+            </w:r>
+          </w:p>
+          <w:p>
+            <w:r>
+              <w:rPr>
+                <w:rFonts w:hint="eastAsia"/>
+              </w:rPr>
+              <w:t>外观/实用新型专利3-5项</w:t>
+            </w:r>
+          </w:p>
+          <w:p>
+            <w:pPr>
+              <w:rPr>
+                <w:rFonts w:hint="eastAsia"/>
+              </w:rPr>
+            </w:pPr>
+            <w:proofErr w:type="gramStart"/>
+            <w:r>
+              <w:rPr>
+                <w:rFonts w:hint="eastAsia"/>
+              </w:rPr>
+              <w:t>抖音</w:t>
+            </w:r>
+            <w:proofErr w:type="gramEnd"/>
+            <w:r>
+              <w:rPr>
+                <w:rFonts w:hint="eastAsia"/>
+              </w:rPr>
+              <w:t>/小红书KOL合作、信息流投放等</w:t>
+            </w:r>
+          </w:p>
         </w:tc>
       </w:tr>
       <w:tr>
@@ -1762,7 +3265,35 @@
             </w:tcMar>
             <w:hideMark/>
           </w:tcPr>
-          <w:p/>
+          <w:p>
+            <w:r>
+              <w:rPr>
+                <w:rFonts w:hint="eastAsia"/>
+              </w:rPr>
+              <w:t>产品演示视频（脚本+拍摄+后期）</w:t>
+            </w:r>
+          </w:p>
+          <w:p>
+            <w:pPr>
+              <w:rPr>
+                <w:rFonts w:hint="eastAsia"/>
+              </w:rPr>
+            </w:pPr>
+            <w:r>
+              <w:rPr>
+                <w:rFonts w:hint="eastAsia"/>
+              </w:rPr>
+              <w:t>技术文档+</w:t>
+            </w:r>
+            <w:proofErr w:type="gramStart"/>
+            <w:r>
+              <w:rPr>
+                <w:rFonts w:hint="eastAsia"/>
+              </w:rPr>
+              <w:t>结项报告</w:t>
+            </w:r>
+            <w:proofErr w:type="gramEnd"/>
+          </w:p>
         </w:tc>
       </w:tr>
       <w:tr>
@@ -1868,10 +3399,10 @@
         <w:tblLook w:val="04A0" w:firstRow="1" w:lastRow="0" w:firstColumn="1" w:lastColumn="0" w:noHBand="0" w:noVBand="1"/>
       </w:tblPr>
       <w:tblGrid>
-        <w:gridCol w:w="1291"/>
-        <w:gridCol w:w="3067"/>
-        <w:gridCol w:w="1160"/>
-        <w:gridCol w:w="1098"/>
+        <w:gridCol w:w="1024"/>
+        <w:gridCol w:w="5793"/>
+        <w:gridCol w:w="709"/>
+        <w:gridCol w:w="764"/>
       </w:tblGrid>
       <w:tr>
         <w:trPr>
@@ -2045,14 +3576,57 @@
             <w:hideMark/>
           </w:tcPr>
           <w:p>
-            <w:r>
-              <w:rPr>
-                <w:rFonts w:hint="eastAsia"/>
-              </w:rPr>
-              <w:t>从哪个平台</w:t>
-            </w:r>
-            <w:r>
-              <w:t>GPU租用/API费用</w:t>
+            <w:proofErr w:type="gramStart"/>
+            <w:r>
+              <w:rPr>
+                <w:rFonts w:hint="eastAsia"/>
+                <w:b/>
+                <w:bCs/>
+              </w:rPr>
+              <w:t>云服务</w:t>
+            </w:r>
+            <w:proofErr w:type="gramEnd"/>
+            <w:r>
+              <w:rPr>
+                <w:rFonts w:hint="eastAsia"/>
+                <w:b/>
+                <w:bCs/>
+              </w:rPr>
+              <w:t>与API调用（2.5万）</w:t>
+            </w:r>
+            <w:r>
+              <w:rPr>
+                <w:rFonts w:hint="eastAsia"/>
+              </w:rPr>
+              <w:t>：包含原型阶段（1.0万）与量</w:t>
+            </w:r>
+            <w:proofErr w:type="gramStart"/>
+            <w:r>
+              <w:rPr>
+                <w:rFonts w:hint="eastAsia"/>
+              </w:rPr>
+              <w:t>产推广</w:t>
+            </w:r>
+            <w:proofErr w:type="gramEnd"/>
+            <w:r>
+              <w:rPr>
+                <w:rFonts w:hint="eastAsia"/>
+              </w:rPr>
+              <w:t>阶段（1.5万）的通义万相、</w:t>
+            </w:r>
+            <w:proofErr w:type="gramStart"/>
+            <w:r>
+              <w:rPr>
+                <w:rFonts w:hint="eastAsia"/>
+              </w:rPr>
+              <w:t>讯飞</w:t>
+            </w:r>
+            <w:proofErr w:type="gramEnd"/>
+            <w:r>
+              <w:rPr>
+                <w:rFonts w:hint="eastAsia"/>
+              </w:rPr>
+              <w:t>AIUI API调用费及云服务器租赁费。</w:t>
             </w:r>
           </w:p>
         </w:tc>
@@ -2138,7 +3712,66 @@
           </w:tcPr>
           <w:p>
             <w:r>
-              <w:t>数据集/软件授权</w:t>
+              <w:rPr>
+                <w:rFonts w:hint="eastAsia"/>
+                <w:b/>
+                <w:bCs/>
+              </w:rPr>
+              <w:t>软件研发（2.5万）</w:t>
+            </w:r>
+            <w:r>
+              <w:rPr>
+                <w:rFonts w:hint="eastAsia"/>
+              </w:rPr>
+              <w:t>：嵌入式固件、后端API及</w:t>
+            </w:r>
+            <w:proofErr w:type="gramStart"/>
+            <w:r>
+              <w:rPr>
+                <w:rFonts w:hint="eastAsia"/>
+              </w:rPr>
+              <w:t>家长端小程序</w:t>
+            </w:r>
+            <w:proofErr w:type="gramEnd"/>
+            <w:r>
+              <w:rPr>
+                <w:rFonts w:hint="eastAsia"/>
+              </w:rPr>
+              <w:t>的开发工具与授权费用。</w:t>
+            </w:r>
+            <w:r>
+              <w:rPr>
+                <w:rFonts w:hint="eastAsia"/>
+              </w:rPr>
+              <w:br/>
+            </w:r>
+            <w:r>
+              <w:rPr>
+                <w:rFonts w:hint="eastAsia"/>
+                <w:b/>
+                <w:bCs/>
+              </w:rPr>
+              <w:t>专利申请（1.0万）</w:t>
+            </w:r>
+            <w:r>
+              <w:rPr>
+                <w:rFonts w:hint="eastAsia"/>
+              </w:rPr>
+              <w:t>：外观及实用新型专利3-5项的申请与代理费用。</w:t>
+            </w:r>
+            <w:r>
+              <w:rPr>
+                <w:rFonts w:hint="eastAsia"/>
+              </w:rPr>
+              <w:br/>
+            </w:r>
+            <w:r>
+              <w:rPr>
+                <w:rFonts w:hint="eastAsia"/>
+                <w:b/>
+                <w:bCs/>
+              </w:rPr>
+              <w:t>工业设计（0.3万）</w:t>
             </w:r>
           </w:p>
         </w:tc>
@@ -2224,7 +3857,48 @@
           </w:tcPr>
           <w:p>
             <w:r>
-              <w:t>外设/测试设备</w:t>
+              <w:rPr>
+                <w:rFonts w:hint="eastAsia"/>
+                <w:b/>
+                <w:bCs/>
+              </w:rPr>
+              <w:t>批量物料（23.7万）：1000台量产BOM采购（¥237/台）。</w:t>
+            </w:r>
+            <w:r>
+              <w:rPr>
+                <w:rFonts w:hint="eastAsia"/>
+                <w:b/>
+                <w:bCs/>
+              </w:rPr>
+              <w:br/>
+              <w:t>模具费与摊销（12.0万）：外壳注塑钢模开模费（8.0万）及剩余模具成本分摊（4.0万）。</w:t>
+            </w:r>
+            <w:r>
+              <w:rPr>
+                <w:rFonts w:hint="eastAsia"/>
+                <w:b/>
+                <w:bCs/>
+              </w:rPr>
+              <w:br/>
+              <w:t>硬件研发（5.0万）：PCB打样×2轮、元器件采购及调试工具。</w:t>
+            </w:r>
+            <w:r>
+              <w:rPr>
+                <w:rFonts w:hint="eastAsia"/>
+                <w:b/>
+                <w:bCs/>
+              </w:rPr>
+              <w:br/>
+              <w:t>代工厂组装测试（2.5万）：1000台SMT贴片与整机组装费。</w:t>
+            </w:r>
+            <w:r>
+              <w:rPr>
+                <w:rFonts w:hint="eastAsia"/>
+                <w:b/>
+                <w:bCs/>
+              </w:rPr>
+              <w:br/>
+              <w:t>原型物料（2.68万）：100台MVP原型BOM采购（¥268/台）。</w:t>
             </w:r>
           </w:p>
         </w:tc>
@@ -2287,6 +3961,7 @@
           </w:tcPr>
           <w:p>
             <w:r>
+              <w:lastRenderedPageBreak/>
               <w:t>其他费用</w:t>
             </w:r>
           </w:p>
@@ -2310,7 +3985,160 @@
           </w:tcPr>
           <w:p>
             <w:r>
-              <w:t>差旅/印刷/不可预见费</w:t>
+              <w:rPr>
+                <w:rFonts w:hint="eastAsia"/>
+                <w:b/>
+                <w:bCs/>
+              </w:rPr>
+              <w:t>营销推广（20.0万）</w:t>
+            </w:r>
+            <w:r>
+              <w:rPr>
+                <w:rFonts w:hint="eastAsia"/>
+              </w:rPr>
+              <w:t>：</w:t>
+            </w:r>
+            <w:proofErr w:type="gramStart"/>
+            <w:r>
+              <w:rPr>
+                <w:rFonts w:hint="eastAsia"/>
+              </w:rPr>
+              <w:t>抖音</w:t>
+            </w:r>
+            <w:proofErr w:type="gramEnd"/>
+            <w:r>
+              <w:rPr>
+                <w:rFonts w:hint="eastAsia"/>
+              </w:rPr>
+              <w:t>/小红书KOL合作、信息流投放及种子用户激励。</w:t>
+            </w:r>
+            <w:r>
+              <w:rPr>
+                <w:rFonts w:hint="eastAsia"/>
+              </w:rPr>
+              <w:br/>
+            </w:r>
+            <w:r>
+              <w:rPr>
+                <w:rFonts w:hint="eastAsia"/>
+                <w:b/>
+                <w:bCs/>
+              </w:rPr>
+              <w:t>电商渠道（8.0万）</w:t>
+            </w:r>
+            <w:r>
+              <w:rPr>
+                <w:rFonts w:hint="eastAsia"/>
+              </w:rPr>
+              <w:t>：</w:t>
+            </w:r>
+            <w:proofErr w:type="gramStart"/>
+            <w:r>
+              <w:rPr>
+                <w:rFonts w:hint="eastAsia"/>
+              </w:rPr>
+              <w:t>天猫</w:t>
+            </w:r>
+            <w:proofErr w:type="gramEnd"/>
+            <w:r>
+              <w:rPr>
+                <w:rFonts w:hint="eastAsia"/>
+              </w:rPr>
+              <w:t>/京东店铺保证金及基础运营费。</w:t>
+            </w:r>
+            <w:r>
+              <w:rPr>
+                <w:rFonts w:hint="eastAsia"/>
+              </w:rPr>
+              <w:br/>
+            </w:r>
+            <w:r>
+              <w:rPr>
+                <w:rFonts w:hint="eastAsia"/>
+                <w:b/>
+                <w:bCs/>
+              </w:rPr>
+              <w:t>行政杂项（8.0万）</w:t>
+            </w:r>
+            <w:r>
+              <w:rPr>
+                <w:rFonts w:hint="eastAsia"/>
+              </w:rPr>
+              <w:t>：各阶段办公场地、差旅、通讯、仓储物流及包装耗材等（1.0+1.5+6.0）。</w:t>
+            </w:r>
+            <w:r>
+              <w:rPr>
+                <w:rFonts w:hint="eastAsia"/>
+              </w:rPr>
+              <w:br/>
+            </w:r>
+            <w:r>
+              <w:rPr>
+                <w:rFonts w:hint="eastAsia"/>
+                <w:b/>
+                <w:bCs/>
+              </w:rPr>
+              <w:t>市场调研（1.0万）</w:t>
+            </w:r>
+            <w:r>
+              <w:rPr>
+                <w:rFonts w:hint="eastAsia"/>
+              </w:rPr>
+              <w:t>：用户访谈</w:t>
+            </w:r>
+            <w:proofErr w:type="gramStart"/>
+            <w:r>
+              <w:rPr>
+                <w:rFonts w:hint="eastAsia"/>
+              </w:rPr>
+              <w:t>及竞品</w:t>
+            </w:r>
+            <w:proofErr w:type="gramEnd"/>
+            <w:r>
+              <w:rPr>
+                <w:rFonts w:hint="eastAsia"/>
+              </w:rPr>
+              <w:t>样品采购费。</w:t>
+            </w:r>
+            <w:r>
+              <w:rPr>
+                <w:rFonts w:hint="eastAsia"/>
+              </w:rPr>
+              <w:br/>
+            </w:r>
+            <w:r>
+              <w:rPr>
+                <w:rFonts w:hint="eastAsia"/>
+                <w:b/>
+                <w:bCs/>
+              </w:rPr>
+              <w:t>视频制作（2.0万）</w:t>
+            </w:r>
+            <w:r>
+              <w:rPr>
+                <w:rFonts w:hint="eastAsia"/>
+              </w:rPr>
+              <w:t>：产品演示视频脚本、拍摄与后期制作。</w:t>
+            </w:r>
+            <w:r>
+              <w:rPr>
+                <w:rFonts w:hint="eastAsia"/>
+              </w:rPr>
+              <w:br/>
+            </w:r>
+            <w:r>
+              <w:rPr>
+                <w:rFonts w:hint="eastAsia"/>
+                <w:b/>
+                <w:bCs/>
+              </w:rPr>
+              <w:t>不可预见费（16.5万）</w:t>
+            </w:r>
+            <w:r>
+              <w:rPr>
+                <w:rFonts w:hint="eastAsia"/>
+              </w:rPr>
+              <w:t>：为应对价格波动与突发情况，按上述硬性支出的约40%预留的备用资金</w:t>
             </w:r>
           </w:p>
         </w:tc>
@@ -2563,7 +4391,7 @@
   <w:abstractNum w:abstractNumId="0" w15:restartNumberingAfterBreak="0">
     <w:nsid w:val="0DDB2C51"/>
     <w:multiLevelType w:val="multilevel"/>
-    <w:tmpl w:val="B3C07914"/>
+    <w:tmpl w:val="79064560"/>
     <w:lvl w:ilvl="0">
       <w:start w:val="1"/>
       <w:numFmt w:val="decimal"/>
@@ -2576,19 +4404,19 @@
         <w:ind w:left="720" w:hanging="360"/>
       </w:pPr>
     </w:lvl>
-    <w:lvl w:ilvl="1" w:tentative="1">
+    <w:lvl w:ilvl="1">
       <w:start w:val="1"/>
-      <w:numFmt w:val="decimal"/>
-      <w:lvlText w:val="%2."/>
+      <w:numFmt w:val="bullet"/>
+      <w:lvlText w:val=""/>
       <w:lvlJc w:val="left"/>
       <w:pPr>
-        <w:tabs>
-          <w:tab w:val="num" w:pos="1440"/>
-        </w:tabs>
-        <w:ind w:left="1440" w:hanging="360"/>
-      </w:pPr>
+        <w:ind w:left="1520" w:hanging="440"/>
+      </w:pPr>
+      <w:rPr>
+        <w:rFonts w:ascii="Wingdings" w:hAnsi="Wingdings" w:hint="default"/>
+      </w:rPr>
     </w:lvl>
-    <w:lvl w:ilvl="2" w:tentative="1">
+    <w:lvl w:ilvl="2">
       <w:start w:val="1"/>
       <w:numFmt w:val="decimal"/>
       <w:lvlText w:val="%3."/>

</xml_diff>